<commit_message>
W 10-07-2026 pre-bible: add 2nd C story, iOS 27 Impersonation Risk Detection
Co-Authored-By: Claude Opus 5.5 <noreply@anthropic.com>
Claude-Session: https://claude.ai/code/session_01F5T5EfKU7bvTfCbU31zr39
</commit_message>
<xml_diff>
--- a/runs/W_10072026/10_07_Wed_Pre_Bible_Pitch.docx
+++ b/runs/W_10072026/10_07_Wed_Pre_Bible_Pitch.docx
@@ -24,7 +24,7 @@
         <w:t>Wednesday, Oct 7, 2026</w:t>
       </w:r>
       <w:r>
-        <w:t xml:space="preserve"> · A + B + C · Prepared Tue, Sept 29, 2026 · Researched from national, local and official sources plus YouTube search counts (observed Sept 29). Audience 55+; no kids, Amazon, Target or Flock.</w:t>
+        <w:t xml:space="preserve"> · A + B + two Cs · Prepared Tue, Sept 29, 2026 · Researched from national, local and official sources plus YouTube search counts (observed Sept 29). Audience 55+; no kids, Amazon, Target or Flock.</w:t>
       </w:r>
     </w:p>
     <w:p>
@@ -450,6 +450,105 @@
           </w:p>
         </w:tc>
       </w:tr>
+      <w:tr>
+        <w:tc>
+          <w:tcPr>
+            <w:tcW w:type="dxa" w:w="504"/>
+          </w:tcPr>
+          <w:p>
+            <w:pPr>
+              <w:spacing w:after="40"/>
+            </w:pPr>
+            <w:r>
+              <w:rPr>
+                <w:sz w:val="19"/>
+              </w:rPr>
+              <w:t>4</w:t>
+            </w:r>
+          </w:p>
+        </w:tc>
+        <w:tc>
+          <w:tcPr>
+            <w:tcW w:type="dxa" w:w="2088"/>
+          </w:tcPr>
+          <w:p>
+            <w:pPr>
+              <w:spacing w:after="40"/>
+            </w:pPr>
+            <w:r>
+              <w:rPr>
+                <w:b/>
+                <w:sz w:val="19"/>
+              </w:rPr>
+              <w:t>YOUR IPHONE CAN NOW SPOT A SCAM IN PROGRESS… BUT IT'S TURNED OFF</w:t>
+            </w:r>
+          </w:p>
+        </w:tc>
+        <w:tc>
+          <w:tcPr>
+            <w:tcW w:type="dxa" w:w="3384"/>
+          </w:tcPr>
+          <w:p>
+            <w:pPr>
+              <w:spacing w:after="40"/>
+            </w:pPr>
+            <w:r>
+              <w:rPr>
+                <w:sz w:val="19"/>
+              </w:rPr>
+              <w:t>A new iOS 27 setting can warn your apps you're being worked by a scammer. It ships switched off.</w:t>
+            </w:r>
+          </w:p>
+        </w:tc>
+        <w:tc>
+          <w:tcPr>
+            <w:tcW w:type="dxa" w:w="1224"/>
+          </w:tcPr>
+          <w:p>
+            <w:pPr>
+              <w:spacing w:after="40"/>
+            </w:pPr>
+            <w:r>
+              <w:rPr>
+                <w:sz w:val="19"/>
+              </w:rPr>
+              <w:t>— (creator explainer 61K)</w:t>
+            </w:r>
+          </w:p>
+        </w:tc>
+        <w:tc>
+          <w:tcPr>
+            <w:tcW w:type="dxa" w:w="1656"/>
+          </w:tcPr>
+          <w:p>
+            <w:pPr>
+              <w:spacing w:after="40"/>
+            </w:pPr>
+            <w:r>
+              <w:rPr>
+                <w:sz w:val="19"/>
+              </w:rPr>
+              <w:t>Wednesday C story (2nd)</w:t>
+            </w:r>
+          </w:p>
+        </w:tc>
+        <w:tc>
+          <w:tcPr>
+            <w:tcW w:type="dxa" w:w="1224"/>
+          </w:tcPr>
+          <w:p>
+            <w:pPr>
+              <w:spacing w:after="40"/>
+            </w:pPr>
+            <w:r>
+              <w:rPr>
+                <w:sz w:val="19"/>
+              </w:rPr>
+              <w:t>HIGH — no app named yet</w:t>
+            </w:r>
+          </w:p>
+        </w:tc>
+      </w:tr>
     </w:tbl>
     <w:p/>
     <w:p>
@@ -460,7 +559,7 @@
         <w:t>SLATE FIT:</w:t>
       </w:r>
       <w:r>
-        <w:t xml:space="preserve"> Fills an A + B + C Wednesday. #1 carries the A: a named daughter on camera and the biggest fresh clip found (5.7M). #2 is a full B with its own victim. #3 is a light C with an 89-year-old. No title matches on the Rossen channel; #3 sits next to a past home-repair live.</w:t>
+        <w:t xml:space="preserve"> Fills an A + B + two-C Wednesday. #1 carries the A: a named daughter on camera and the biggest fresh clip found (5.7M). #2 is a full B with its own victim. #3 is a light C with an 89-year-old. #4 is the do-it-now exhale: update the phone, flip one switch. No title matches on the Rossen channel; #3 sits next to a past home-repair live.</w:t>
       </w:r>
     </w:p>
     <w:p>
@@ -1287,6 +1386,262 @@
       </w:r>
     </w:p>
     <w:p>
+      <w:r>
+        <w:br w:type="page"/>
+      </w:r>
+    </w:p>
+    <w:p>
+      <w:pPr>
+        <w:pStyle w:val="Heading1"/>
+      </w:pPr>
+      <w:r>
+        <w:rPr>
+          <w:color w:val="000000"/>
+          <w:sz w:val="32"/>
+        </w:rPr>
+        <w:t>4. YOUR IPHONE CAN NOW SPOT A SCAM IN PROGRESS… BUT IT'S TURNED OFF</w:t>
+      </w:r>
+    </w:p>
+    <w:p>
+      <w:r>
+        <w:rPr>
+          <w:b/>
+        </w:rPr>
+        <w:t>Slot:</w:t>
+      </w:r>
+      <w:r>
+        <w:t xml:space="preserve"> Wednesday C story (2nd) · </w:t>
+      </w:r>
+      <w:r>
+        <w:rPr>
+          <w:b/>
+        </w:rPr>
+        <w:t>Confidence: HIGH</w:t>
+      </w:r>
+      <w:r>
+        <w:t xml:space="preserve"> · </w:t>
+      </w:r>
+      <w:r>
+        <w:rPr>
+          <w:i/>
+        </w:rPr>
+        <w:t>Service segment; which apps use it is still unknown</w:t>
+      </w:r>
+    </w:p>
+    <w:p>
+      <w:r>
+        <w:rPr>
+          <w:b/>
+        </w:rPr>
+        <w:t>SLOT FIT:</w:t>
+      </w:r>
+      <w:r>
+        <w:t xml:space="preserve"> Wednesday C story. It fits a short closing slot: a do-it-now fix for every iPhone viewer, fresh (iOS 27, Sept 2026), with a natural hand-off from the A and B stories. No victim and no news footage, so it's Jeff and a screen-share. It won't carry more than a C.</w:t>
+      </w:r>
+    </w:p>
+    <w:p>
+      <w:pPr>
+        <w:pStyle w:val="Heading3"/>
+      </w:pPr>
+      <w:r>
+        <w:rPr>
+          <w:color w:val="333333"/>
+          <w:sz w:val="22"/>
+        </w:rPr>
+        <w:t>WORKING TEASE</w:t>
+      </w:r>
+    </w:p>
+    <w:p>
+      <w:pPr>
+        <w:spacing w:before="80" w:after="120"/>
+        <w:ind w:left="432"/>
+      </w:pPr>
+      <w:r>
+        <w:rPr>
+          <w:i/>
+        </w:rPr>
+        <w:t>SCAMMERS DON'T HACK YOUR PHONE. THEY TALK YOU INTO DOING IT YOURSELF. NOW YOUR IPHONE CAN SPOT THE SIGNS… AND WARN YOUR APPS BEFORE YOU SEND THE MONEY. BUT APPLE SHIPPED IT TURNED OFF. GRAB YOUR PHONE. WE'LL DO IT TOGETHER, RIGHT NOW.</w:t>
+      </w:r>
+    </w:p>
+    <w:p>
+      <w:pPr>
+        <w:pStyle w:val="Heading3"/>
+      </w:pPr>
+      <w:r>
+        <w:rPr>
+          <w:color w:val="333333"/>
+          <w:sz w:val="22"/>
+        </w:rPr>
+        <w:t>THE HOOK</w:t>
+      </w:r>
+    </w:p>
+    <w:p>
+      <w:r>
+        <w:t xml:space="preserve">iOS 27 adds Impersonation Risk Detection, built for the scam where someone posing as your bank, the government or a loved one talks you into sending money or changing your account. When you take a risky step in an app that supports it, the iPhone judges on the device whether a scam may be in progress. It uses patterns like how many calls and emails you've sent and received, plus Apple Account activity. The app gets back only a rating (Unknown, Medium or High) and can ask for extra verification or show a warning. Apple says it doesn't read your Photos, Messages or Mail. </w:t>
+      </w:r>
+      <w:r>
+        <w:rPr>
+          <w:b/>
+        </w:rPr>
+        <w:t>It's off by default,</w:t>
+      </w:r>
+      <w:r>
+        <w:t xml:space="preserve"> and Apple hasn't said which apps use it.</w:t>
+      </w:r>
+    </w:p>
+    <w:p>
+      <w:pPr>
+        <w:pStyle w:val="Heading3"/>
+      </w:pPr>
+      <w:r>
+        <w:rPr>
+          <w:color w:val="333333"/>
+          <w:sz w:val="22"/>
+        </w:rPr>
+        <w:t>HOW IT WORKS</w:t>
+      </w:r>
+    </w:p>
+    <w:p>
+      <w:pPr>
+        <w:pStyle w:val="ListBullet"/>
+        <w:spacing w:after="40"/>
+      </w:pPr>
+      <w:r>
+        <w:t>You're about to pay or change account details in a supporting app.</w:t>
+      </w:r>
+    </w:p>
+    <w:p>
+      <w:pPr>
+        <w:pStyle w:val="ListBullet"/>
+        <w:spacing w:after="40"/>
+      </w:pPr>
+      <w:r>
+        <w:rPr>
+          <w:b/>
+        </w:rPr>
+        <w:t>The iPhone rates the risk on the device</w:t>
+      </w:r>
+      <w:r>
+        <w:t>: Unknown, Medium or High.</w:t>
+      </w:r>
+    </w:p>
+    <w:p>
+      <w:pPr>
+        <w:pStyle w:val="ListBullet"/>
+        <w:spacing w:after="40"/>
+      </w:pPr>
+      <w:r>
+        <w:rPr>
+          <w:b/>
+        </w:rPr>
+        <w:t>The app sees only the rating</w:t>
+      </w:r>
+      <w:r>
+        <w:t>, not your data, and decides whether to warn you or add a check.</w:t>
+      </w:r>
+    </w:p>
+    <w:p>
+      <w:pPr>
+        <w:pStyle w:val="ListBullet"/>
+        <w:spacing w:after="40"/>
+      </w:pPr>
+      <w:r>
+        <w:t>"Unknown" doesn't mean safe. It means no signs were found.</w:t>
+      </w:r>
+    </w:p>
+    <w:p>
+      <w:pPr>
+        <w:pStyle w:val="Heading3"/>
+      </w:pPr>
+      <w:r>
+        <w:rPr>
+          <w:color w:val="333333"/>
+          <w:sz w:val="22"/>
+        </w:rPr>
+        <w:t>FOOTAGE — BE HONEST ABOUT THIS</w:t>
+      </w:r>
+    </w:p>
+    <w:p>
+      <w:r>
+        <w:t xml:space="preserve">No news package and no victim. The segment is </w:t>
+      </w:r>
+      <w:r>
+        <w:rPr>
+          <w:b/>
+        </w:rPr>
+        <w:t>Jeff on his own iPhone</w:t>
+      </w:r>
+      <w:r>
+        <w:t>: update to iOS 27, then flip the switch, live. Creator explainers exist for b-roll with permission: "iOS 27 Can Now Detect Scams on Your iPhone — Turn This ON!" (Pixel &amp; POD, 60,917 views, this month) and Trevor Nace (28,285).</w:t>
+      </w:r>
+    </w:p>
+    <w:p>
+      <w:pPr>
+        <w:pStyle w:val="Heading3"/>
+      </w:pPr>
+      <w:r>
+        <w:rPr>
+          <w:color w:val="333333"/>
+          <w:sz w:val="22"/>
+        </w:rPr>
+        <w:t>THE PAYOFF</w:t>
+      </w:r>
+    </w:p>
+    <w:p>
+      <w:pPr>
+        <w:pStyle w:val="ListBullet"/>
+        <w:spacing w:after="40"/>
+      </w:pPr>
+      <w:r>
+        <w:rPr>
+          <w:b/>
+        </w:rPr>
+        <w:t>Update your phone:</w:t>
+      </w:r>
+      <w:r>
+        <w:t xml:space="preserve"> Settings → General → Software Update → install iOS 27. </w:t>
+      </w:r>
+      <w:r>
+        <w:rPr>
+          <w:i/>
+        </w:rPr>
+        <w:t>(verify your model is supported)</w:t>
+      </w:r>
+    </w:p>
+    <w:p>
+      <w:pPr>
+        <w:pStyle w:val="ListBullet"/>
+        <w:spacing w:after="40"/>
+      </w:pPr>
+      <w:r>
+        <w:rPr>
+          <w:b/>
+        </w:rPr>
+        <w:t>Turn it on:</w:t>
+      </w:r>
+      <w:r>
+        <w:t xml:space="preserve"> Settings → Privacy &amp; Security → Impersonation Risk Detection → Share with App Developers.</w:t>
+      </w:r>
+    </w:p>
+    <w:p>
+      <w:pPr>
+        <w:pStyle w:val="ListBullet"/>
+        <w:spacing w:after="40"/>
+      </w:pPr>
+      <w:r>
+        <w:t>Update your banking apps too. The protection only works in apps that add it.</w:t>
+      </w:r>
+    </w:p>
+    <w:p>
+      <w:pPr>
+        <w:pStyle w:val="ListBullet"/>
+        <w:spacing w:after="40"/>
+      </w:pPr>
+      <w:r>
+        <w:t>Still the rule: no real bank or agency asks you to move money while they're on the phone. Hang up and call the number on your card.</w:t>
+      </w:r>
+    </w:p>
+    <w:p>
       <w:pPr>
         <w:pStyle w:val="Heading2"/>
       </w:pPr>
@@ -1729,6 +2084,180 @@
           <w:color w:val="333333"/>
           <w:sz w:val="22"/>
         </w:rPr>
+        <w:t>STORY 4 — iOS 27 IMPERSONATION RISK DETECTION</w:t>
+      </w:r>
+    </w:p>
+    <w:p>
+      <w:r>
+        <w:rPr>
+          <w:b/>
+        </w:rPr>
+        <w:t>Confirmed:</w:t>
+      </w:r>
+    </w:p>
+    <w:p>
+      <w:pPr>
+        <w:pStyle w:val="ListBullet"/>
+        <w:spacing w:after="40"/>
+      </w:pPr>
+      <w:r>
+        <w:t>9to5Mac, Sept 16, 2026: protects "against active social engineering scams… an attacker might pose as a bank, government agency, or someone you trust to pressure or guide you into making a payment or changing your account details." Apps receive Unknown / Medium / High and decide the action. Path: Settings → Privacy &amp; Security → Impersonation Risk Detection → Share with App Developers. Off by default. "Apple hasn't published a list of those apps." 9to5mac.com/2026/09/16/ios-27-adds-scam-prevention-feature-to-iphone-heres-how-to-enable-it/</w:t>
+      </w:r>
+    </w:p>
+    <w:p>
+      <w:pPr>
+        <w:pStyle w:val="ListBullet"/>
+        <w:spacing w:after="40"/>
+      </w:pPr>
+      <w:r>
+        <w:t>Help Net Security, Sept 24, 2026: signals include "device-use patterns, including the approximate number of phone calls and emails sent or received" and "Apple Account information, such as app downloads and content purchases." "Processed on the device"; Apple doesn't analyze Photos, Messages or Mail. The app gets "only the resulting risk level." helpnetsecurity.com/2026/09/24/apple-ios-27-impersonation-risk-detection/</w:t>
+      </w:r>
+    </w:p>
+    <w:p>
+      <w:pPr>
+        <w:pStyle w:val="ListBullet"/>
+        <w:spacing w:after="40"/>
+      </w:pPr>
+      <w:r>
+        <w:t>Apple support doc cited by both: support.apple.com/en-us/127906 (not loaded).</w:t>
+      </w:r>
+    </w:p>
+    <w:p>
+      <w:pPr>
+        <w:pStyle w:val="ListBullet"/>
+        <w:spacing w:after="40"/>
+      </w:pPr>
+      <w:r>
+        <w:t>Clips (Sept 29, this-month search): Pixel &amp; POD 60,917 (NeEWKhV4aoE); Trevor Nace 28,285 (lFzfSVxOsO0).</w:t>
+      </w:r>
+    </w:p>
+    <w:p>
+      <w:pPr>
+        <w:pStyle w:val="ListBullet"/>
+        <w:spacing w:after="40"/>
+      </w:pPr>
+      <w:r>
+        <w:t>Repeat check: no iOS 27 or Impersonation Risk Detection title on the Rossen channel. Adjacent: "This iPhone Setting Tracks You" (742K) and "iPhone Hack Warning — Change These 2 Settings NOW!" were settings segments, not this feature.</w:t>
+      </w:r>
+    </w:p>
+    <w:p>
+      <w:r>
+        <w:rPr>
+          <w:b/>
+        </w:rPr>
+        <w:t>Sources:</w:t>
+      </w:r>
+      <w:r>
+        <w:t xml:space="preserve"> URL at the end of each Confirmed line above.</w:t>
+      </w:r>
+    </w:p>
+    <w:p>
+      <w:r>
+        <w:rPr>
+          <w:b/>
+        </w:rPr>
+        <w:t>NEEDS VERIFICATION:</w:t>
+      </w:r>
+    </w:p>
+    <w:p>
+      <w:pPr>
+        <w:pStyle w:val="ListBullet"/>
+        <w:spacing w:after="40"/>
+      </w:pPr>
+      <w:r>
+        <w:t xml:space="preserve">🚨 </w:t>
+      </w:r>
+      <w:r>
+        <w:rPr>
+          <w:b/>
+        </w:rPr>
+        <w:t>The sexiest line outruns the sourcing.</w:t>
+      </w:r>
+      <w:r>
+        <w:t xml:space="preserve"> "Your iPhone can spot a scam in progress" is true only inside apps that support it, and </w:t>
+      </w:r>
+      <w:r>
+        <w:rPr>
+          <w:b/>
+        </w:rPr>
+        <w:t>no bank or app is confirmed.</w:t>
+      </w:r>
+      <w:r>
+        <w:t xml:space="preserve"> Call Chase, Bank of America, Wells Fargo, PayPal and Zelle before air. If none have it, the tease becomes "turn it on now, before your bank switches it on."</w:t>
+      </w:r>
+    </w:p>
+    <w:p>
+      <w:pPr>
+        <w:pStyle w:val="ListBullet"/>
+        <w:spacing w:after="40"/>
+      </w:pPr>
+      <w:r>
+        <w:t xml:space="preserve">⚠️ The user brief said "iOS 17." The feature is in </w:t>
+      </w:r>
+      <w:r>
+        <w:rPr>
+          <w:b/>
+        </w:rPr>
+        <w:t>iOS 27</w:t>
+      </w:r>
+      <w:r>
+        <w:t xml:space="preserve"> (Sept 2026). iOS 17 was 2023. Air "iOS 27."</w:t>
+      </w:r>
+    </w:p>
+    <w:p>
+      <w:pPr>
+        <w:pStyle w:val="ListBullet"/>
+        <w:spacing w:after="40"/>
+      </w:pPr>
+      <w:r>
+        <w:t>⚠️ Not loaded: iOS 27's exact release date and supported iPhone models. Pull them from Apple before telling viewers to update.</w:t>
+      </w:r>
+    </w:p>
+    <w:p>
+      <w:pPr>
+        <w:pStyle w:val="ListBullet"/>
+        <w:spacing w:after="40"/>
+      </w:pPr>
+      <w:r>
+        <w:t xml:space="preserve">⚠️ Does it react to </w:t>
+      </w:r>
+      <w:r>
+        <w:rPr>
+          <w:i/>
+        </w:rPr>
+        <w:t>being on a call</w:t>
+      </w:r>
+      <w:r>
+        <w:t>? Sources say only "approximate number of phone calls." Don't say "it listens to your calls." It doesn't read content, per Apple.</w:t>
+      </w:r>
+    </w:p>
+    <w:p>
+      <w:pPr>
+        <w:pStyle w:val="ListBullet"/>
+        <w:spacing w:after="40"/>
+      </w:pPr>
+      <w:r>
+        <w:t>⚠️ Optional add-on: iOS 26's Call Screening (screen unknown callers). Sourced only from search results (gHacks, HuffPost). Verify the path before adding it.</w:t>
+      </w:r>
+    </w:p>
+    <w:p>
+      <w:pPr>
+        <w:pStyle w:val="ListBullet"/>
+        <w:spacing w:after="40"/>
+      </w:pPr>
+      <w:r>
+        <w:t>⚠️ Software Update path is the standard iOS path. Confirm on Jeff's phone.</w:t>
+      </w:r>
+    </w:p>
+    <w:p>
+      <w:pPr>
+        <w:pStyle w:val="Heading3"/>
+      </w:pPr>
+      <w:r>
+        <w:rPr>
+          <w:color w:val="333333"/>
+          <w:sz w:val="22"/>
+        </w:rPr>
         <w:t>STORIES CUT — SOURCING PRESERVED</w:t>
       </w:r>
     </w:p>
@@ -1864,6 +2393,21 @@
       </w:r>
       <w:r>
         <w:t xml:space="preserve"> do we name the company without its response?</w:t>
+      </w:r>
+    </w:p>
+    <w:p>
+      <w:pPr>
+        <w:pStyle w:val="ListBullet"/>
+        <w:spacing w:after="40"/>
+      </w:pPr>
+      <w:r>
+        <w:rPr>
+          <w:b/>
+        </w:rPr>
+        <w:t>Story 4:</w:t>
+      </w:r>
+      <w:r>
+        <w:t xml:space="preserve"> if no bank supports it by air, do we still run it as "turn it on now"? And do we fold in iOS 26 Call Screening for the 'detect scam calls' angle?</w:t>
       </w:r>
     </w:p>
     <w:sectPr>

</xml_diff>

<commit_message>
W 10-07-2026 pre-bible: A becomes deed fraud (NJ SCI report, Harris County suit, caregiver case)
Co-Authored-By: Claude Opus 5.5 <noreply@anthropic.com>
Claude-Session: https://claude.ai/code/session_01F5T5EfKU7bvTfCbU31zr39
</commit_message>
<xml_diff>
--- a/runs/W_10072026/10_07_Wed_Pre_Bible_Pitch.docx
+++ b/runs/W_10072026/10_07_Wed_Pre_Bible_Pitch.docx
@@ -170,7 +170,7 @@
                 <w:b/>
                 <w:sz w:val="19"/>
               </w:rPr>
-              <w:t>YOU HIRED HER TO CARE FOR DAD… SHE TOOK HIS HOUSE FOR $5</w:t>
+              <w:t>THEY STOLE HER HOUSE WITH A PIECE OF PAPER</w:t>
             </w:r>
           </w:p>
         </w:tc>
@@ -186,20 +186,7 @@
               <w:rPr>
                 <w:sz w:val="19"/>
               </w:rPr>
-              <w:t xml:space="preserve">Dad's caregiver got his deed for $5. His daughter found him dead three days, and police cuffed </w:t>
-            </w:r>
-            <w:r>
-              <w:rPr>
-                <w:i/>
-                <w:sz w:val="19"/>
-              </w:rPr>
-              <w:t>her</w:t>
-            </w:r>
-            <w:r>
-              <w:rPr>
-                <w:sz w:val="19"/>
-              </w:rPr>
-              <w:t>.</w:t>
+              <w:t>A forged deed, filed at the county, and your paid-off house belongs to someone else. Sometimes it's the caregiver you let in.</w:t>
             </w:r>
           </w:p>
         </w:tc>
@@ -215,7 +202,7 @@
               <w:rPr>
                 <w:sz w:val="19"/>
               </w:rPr>
-              <w:t>🔥 YouTube 5.7M (WSMV Short)</w:t>
+              <w:t>🔥 YouTube 5.7M (WSMV) · 2.1M (Epic Real Estate)</w:t>
             </w:r>
           </w:p>
         </w:tc>
@@ -559,7 +546,7 @@
         <w:t>SLATE FIT:</w:t>
       </w:r>
       <w:r>
-        <w:t xml:space="preserve"> Fills an A + B + two-C Wednesday. #1 carries the A: a named daughter on camera and the biggest fresh clip found (5.7M). #2 is a full B with its own victim. #3 is a light C with an 89-year-old. #4 is the do-it-now exhale: update the phone, flip one switch. No title matches on the Rossen channel; #3 sits next to a past home-repair live.</w:t>
+        <w:t xml:space="preserve"> Fills an A + B + two-C Wednesday. #1 carries the A: two named families, a state report and a county lawsuit from Sept 9, and the biggest fresh clips found (5.7M, 2.1M). #2 is a full B with its own victim. #3 is a light C with an 89-year-old. #4 is the do-it-now exhale: update the phone, flip one switch. #1 follows an April B on deed fraud (per producer) with new 9/9 pegs; #3 sits next to a past home-repair live.</w:t>
       </w:r>
     </w:p>
     <w:p>
@@ -576,7 +563,7 @@
           <w:color w:val="000000"/>
           <w:sz w:val="32"/>
         </w:rPr>
-        <w:t>1. YOU HIRED HER TO CARE FOR DAD… SHE TOOK HIS HOUSE FOR $5</w:t>
+        <w:t>1. THEY STOLE HER HOUSE WITH A PIECE OF PAPER</w:t>
       </w:r>
     </w:p>
     <w:p>
@@ -602,7 +589,7 @@
         <w:rPr>
           <w:i/>
         </w:rPr>
-        <w:t>Accused, not charged</w:t>
+        <w:t>Allegations, not convictions</w:t>
       </w:r>
     </w:p>
     <w:p>
@@ -613,7 +600,7 @@
         <w:t>SLOT FIT:</w:t>
       </w:r>
       <w:r>
-        <w:t xml:space="preserve"> Wednesday A story. It carries it: a named daughter on camera in four outlets, a second fresh case (Florida arrest 9/17), and mechanics deep enough for 7–8 pages.</w:t>
+        <w:t xml:space="preserve"> Wednesday A story. It carries it: two named families, a 9/9 state report, a 9/9 county lawsuit, and 5.7M and 2.1M clips.</w:t>
       </w:r>
     </w:p>
     <w:p>
@@ -638,7 +625,7 @@
         <w:rPr>
           <w:i/>
         </w:rPr>
-        <w:t xml:space="preserve"> — WSMV 4 Nashville YouTube Short, 5,680,248 views (observed 9/29), uploaded ~Aug 29 (article date) https://www.youtube.com/shorts/3EzgKCWb83Q · appears to show daughter Nora Rowland on the deed (title, article) </w:t>
+        <w:t xml:space="preserve"> — YouTube: WSMV Short 5,680,248 views, uploaded ~Aug 29 (caregiver deed) · Epic Real Estate 2,076,283, uploaded Aug 28 per producer · observed 9/29 https://www.youtube.com/shorts/3EzgKCWb83Q · https://www.youtube.com/watch?v=rlxysfWUkmM </w:t>
       </w:r>
       <w:r>
         <w:rPr>
@@ -668,19 +655,7 @@
         <w:rPr>
           <w:i/>
         </w:rPr>
-        <w:t xml:space="preserve">YOU HIRE SOMEONE TO CARE FOR YOUR DAD… IN HIS OWN HOME. WEEKS LATER SHE HAS HIS POWER OF ATTORNEY. THEN HIS HOUSE… FOR FIVE DOLLARS. HIS DAUGHTER FINDS OUT HE'S BEEN DEAD THREE DAYS… AND POLICE PUT </w:t>
-      </w:r>
-      <w:r>
-        <w:rPr>
-          <w:i/>
-        </w:rPr>
-        <w:t>HER</w:t>
-      </w:r>
-      <w:r>
-        <w:rPr>
-          <w:i/>
-        </w:rPr>
-        <w:t xml:space="preserve"> IN HANDCUFFS. THE FREE ALERT THAT TELLS YOU THE SECOND SOMEONE TOUCHES YOUR PARENT'S DEED.</w:t>
+        <w:t>YOU PAID OFF YOUR HOUSE. IT'S YOURS. UNTIL SOMEONE FILES ONE PIECE OF PAPER AT THE COUNTY… AND NOW IT'S THEIRS. THEY'RE SELLING IT. BORROWING AGAINST IT. MOVING IN. ONE MAN'S CAREGIVER ALLEGEDLY GOT HIS DEED FOR FIVE DOLLARS. THE FREE ALERT THAT TELLS YOU THE SECOND SOMEONE TOUCHES YOUR DEED.</w:t>
       </w:r>
     </w:p>
     <w:p>
@@ -697,13 +672,16 @@
     </w:p>
     <w:p>
       <w:r>
-        <w:t xml:space="preserve">Robert Rowland, 75, of Conway, SC, had Parkinson's and a brain injury. In March 2024 an agency sent caregiver Sarah Smalls. By April she was his power of attorney, and on April 17 a quitclaim deed moved his home to her for $5. His daughter Nora drove down from Baltimore when he stopped calling. She learned over a Ring doorbell that he'd died three days earlier, then police handcuffed her; the charges were dismissed. Two years later, Nora says, the caregiver still lives in the $300,000 house. Police are investigating; </w:t>
+        <w:t xml:space="preserve">Deed fraud: a scammer forges a deed, records it at the county, then sells or borrows against a home the owner still owns. </w:t>
       </w:r>
       <w:r>
         <w:rPr>
           <w:b/>
         </w:rPr>
-        <w:t>Smalls has not been charged.</w:t>
+        <w:t>Paid-off homes are the target:</w:t>
+      </w:r>
+      <w:r>
+        <w:t xml:space="preserve"> no lender lien, no lender checking at closing (Yahoo/Moneywise). On Sept 9, Harris County, TX sued nine people it says took at least 10 homes; Keata Wade's family lost her late grandmother's house to fake deeds. The same day, New Jersey's investigation commission released its deed-fraud report. It opens with the woman charged with trying to steal the title to Graceland. The insider version: in Conway, SC, Robert Rowland's caregiver allegedly got his deed for $5, and his daughter was the one handcuffed. The caregiver has not been charged.</w:t>
       </w:r>
     </w:p>
     <w:p>
@@ -727,10 +705,10 @@
         <w:rPr>
           <w:b/>
         </w:rPr>
-        <w:t>Power of attorney first.</w:t>
+        <w:t>Pick a target:</w:t>
       </w:r>
       <w:r>
-        <w:t xml:space="preserve"> Then she can sign at the bank and the courthouse.</w:t>
+        <w:t xml:space="preserve"> paid-off, vacant, elderly, deceased or out-of-state owners (NJ report).</w:t>
       </w:r>
     </w:p>
     <w:p>
@@ -742,19 +720,10 @@
         <w:rPr>
           <w:b/>
         </w:rPr>
-        <w:t>Nobody checks the deal.</w:t>
+        <w:t>Fake the owner:</w:t>
       </w:r>
       <w:r>
-        <w:t xml:space="preserve"> Register of deeds: "If it contains all the correct information… we record it."</w:t>
-      </w:r>
-    </w:p>
-    <w:p>
-      <w:pPr>
-        <w:pStyle w:val="ListBullet"/>
-        <w:spacing w:after="40"/>
-      </w:pPr>
-      <w:r>
-        <w:t>Cash follows. Nora alleges about $27,000, including $14,000 in cash.</w:t>
+        <w:t xml:space="preserve"> forged signature, fake ID, a fooled notary.</w:t>
       </w:r>
     </w:p>
     <w:p>
@@ -766,10 +735,51 @@
         <w:rPr>
           <w:b/>
         </w:rPr>
-        <w:t>It's not one case.</w:t>
+        <w:t>File it:</w:t>
       </w:r>
       <w:r>
-        <w:t xml:space="preserve"> Port St. Lucie, FL, Sept 17: police say a caregiver drained an 84-year-old from ~$106K to ~$4,900 and put him on a $616,550 mortgage.</w:t>
+        <w:t xml:space="preserve"> "If it contains all the correct information… we record it." (Horry County deeds office)</w:t>
+      </w:r>
+    </w:p>
+    <w:p>
+      <w:pPr>
+        <w:pStyle w:val="ListBullet"/>
+        <w:spacing w:after="40"/>
+      </w:pPr>
+      <w:r>
+        <w:rPr>
+          <w:b/>
+        </w:rPr>
+        <w:t>Cash out:</w:t>
+      </w:r>
+      <w:r>
+        <w:t xml:space="preserve"> a quick cash sale, a remote closing or a loan. Industry estimate: seniors absorb </w:t>
+      </w:r>
+      <w:r>
+        <w:rPr>
+          <w:b/>
+        </w:rPr>
+        <w:t>44%</w:t>
+      </w:r>
+      <w:r>
+        <w:t xml:space="preserve"> of dollar losses (cited in the NJ report).</w:t>
+      </w:r>
+    </w:p>
+    <w:p>
+      <w:pPr>
+        <w:pStyle w:val="Heading3"/>
+      </w:pPr>
+      <w:r>
+        <w:rPr>
+          <w:color w:val="333333"/>
+          <w:sz w:val="22"/>
+        </w:rPr>
+        <w:t>WHAT'S NEW</w:t>
+      </w:r>
+    </w:p>
+    <w:p>
+      <w:r>
+        <w:t>Ran as a B in April, per the producer. New: the 9/9 NJ report, the 9/9 Harris suit, the caregiver case.</w:t>
       </w:r>
     </w:p>
     <w:p>
@@ -793,10 +803,10 @@
         <w:rPr>
           <w:b/>
         </w:rPr>
-        <w:t>The get: WSMV Short, 5.7M</w:t>
+        <w:t>The get: WSMV 5.7M</w:t>
       </w:r>
       <w:r>
-        <w:t xml:space="preserve"> (clearance from WSMV and Gray).</w:t>
+        <w:t xml:space="preserve"> (Nora Rowland), plus Inside Edition 272K.</w:t>
       </w:r>
     </w:p>
     <w:p>
@@ -805,7 +815,7 @@
         <w:spacing w:after="40"/>
       </w:pPr>
       <w:r>
-        <w:t>Inside Edition, Nora on camera, 272K (-tbGdiOzo80); WMBF 128K (7WXREQ4_5Vo), which may carry Ring and bodycam footage.</w:t>
+        <w:t>Epic Real Estate 2.1M and Holy Schmidt 858K ("Retirees, once you pay off your mortgage…"): creator explainers, so permission is needed.</w:t>
       </w:r>
     </w:p>
     <w:p>
@@ -814,7 +824,7 @@
         <w:spacing w:after="40"/>
       </w:pPr>
       <w:r>
-        <w:t>Jeff screen-share: the county deed-alert sign-up.</w:t>
+        <w:t>Harris County: no video found (pull KPRC/KHOU). Jeff screen-share: deed-alert sign-up.</w:t>
       </w:r>
     </w:p>
     <w:p>
@@ -856,7 +866,7 @@
         <w:spacing w:after="40"/>
       </w:pPr>
       <w:r>
-        <w:t>Ask the agency: employee, bonded and insured, or independent contractor?</w:t>
+        <w:t>Look up your own deed online now. Watch for a missing tax bill or water bill.</w:t>
       </w:r>
     </w:p>
     <w:p>
@@ -865,13 +875,7 @@
         <w:spacing w:after="40"/>
       </w:pPr>
       <w:r>
-        <w:t xml:space="preserve">Family POA or trust while Mom or Dad can still sign; weekly calls and surprise visits. </w:t>
-      </w:r>
-      <w:r>
-        <w:rPr>
-          <w:i/>
-        </w:rPr>
-        <w:t>(AARP Maryland)</w:t>
+        <w:t>Ask your title insurer about forgery coverage. Vet caregivers: employee or contractor?</w:t>
       </w:r>
     </w:p>
     <w:p>
@@ -1688,7 +1692,7 @@
           <w:color w:val="333333"/>
           <w:sz w:val="22"/>
         </w:rPr>
-        <w:t>STORY 1 — CAREGIVER TOOK THE HOUSE</w:t>
+        <w:t>STORY 1 — DEED FRAUD (incl. caregiver case)</w:t>
       </w:r>
     </w:p>
     <w:p>
@@ -1697,6 +1701,42 @@
           <w:b/>
         </w:rPr>
         <w:t>Confirmed:</w:t>
+      </w:r>
+    </w:p>
+    <w:p>
+      <w:pPr>
+        <w:pStyle w:val="ListBullet"/>
+        <w:spacing w:after="40"/>
+      </w:pPr>
+      <w:r>
+        <w:t>NJ State Commission of Investigation, "Deed Fraud and Related Schemes," Sept 9, 2026 (85-page PDF; text saved at research/NJ_SCI_deed_fraud_2026-09-09.txt). Executive summary: after the May 2024 FBI warning, "federal law enforcement arrested a woman and charged her with attempting to steal the title to Graceland." The FBI counts ~135 NJ incidents, "among the top three states nationally." Senior citizens "absorb 44 percent of all dollar losses" (a real-estate publication's estimate). Targets include "vacation homes, rental properties, and properties owned by elderly, deceased, or out-of-state individuals." Proposes an optional title "freeze… much like" a credit freeze. nj.gov/sci/documents/Final%20Deed%20Fraud%20Report%209-9-2026.pdf</w:t>
+      </w:r>
+    </w:p>
+    <w:p>
+      <w:pPr>
+        <w:pStyle w:val="ListBullet"/>
+        <w:spacing w:after="40"/>
+      </w:pPr>
+      <w:r>
+        <w:t>Hoodline, Sept 2026: Harris County Attorney Abbie Kamin sued nine people Sept 9. At least 10 homes ($100K–$250K each) via forged signatures, fake identities and fraudulent documents, often targeting deceased owners' estates; owners lost access to seven homes. Keata Wade's family lost her late grandmother's Teton Street home (fake deeds recorded July 2023 and March 2025). Kamin: "home theft." hoodline.com/2026/09/harris-county-sues-nine-accused-of-stealing-at-least-10-homes-via-fake-deeds/</w:t>
+      </w:r>
+    </w:p>
+    <w:p>
+      <w:pPr>
+        <w:pStyle w:val="ListBullet"/>
+        <w:spacing w:after="40"/>
+      </w:pPr>
+      <w:r>
+        <w:t>Yahoo/Moneywise, Sept 10: FBI June 16 alert on criminals impersonating owners. Unencumbered homes "lack a lender's lien that must be cleared at closing." D. Mass. charged three people July 23 (~$1.5M, four states). Advice: county recorder notifications, watch tax and water bills, title insurance post-policy forgery coverage, report to IC3. finance.yahoo.com/real-estate/articles/fbi-issues-warning-us-homeowners-105500748.html</w:t>
+      </w:r>
+    </w:p>
+    <w:p>
+      <w:pPr>
+        <w:pStyle w:val="ListBullet"/>
+        <w:spacing w:after="40"/>
+      </w:pPr>
+      <w:r>
+        <w:t>Clips (9/29): Epic Real Estate "FBI Issues WARNING About Paid Off Mortgages" 2,076,283 (rlxysfWUkmM); Holy Schmidt "Retirees, Once You Pay Off Your Mortgage, You Have a BIG FRAUD RISK" 858,441 (5QPLImV9PgY).</w:t>
       </w:r>
     </w:p>
     <w:p>
@@ -1779,6 +1819,51 @@
           <w:b/>
         </w:rPr>
         <w:t>NEEDS VERIFICATION:</w:t>
+      </w:r>
+    </w:p>
+    <w:p>
+      <w:pPr>
+        <w:pStyle w:val="ListBullet"/>
+        <w:spacing w:after="40"/>
+      </w:pPr>
+      <w:r>
+        <w:t>⚠️ The producer's note says "55-page report." The PDF is 85 pages; the body runs to about p. 55 before appendices. Say "a new state report."</w:t>
+      </w:r>
+    </w:p>
+    <w:p>
+      <w:pPr>
+        <w:pStyle w:val="ListBullet"/>
+        <w:spacing w:after="40"/>
+      </w:pPr>
+      <w:r>
+        <w:t>⚠️ The Graceland case is from 2024 (the NJ report's opener, not a new case). Use it as the hook line, not news.</w:t>
+      </w:r>
+    </w:p>
+    <w:p>
+      <w:pPr>
+        <w:pStyle w:val="ListBullet"/>
+        <w:spacing w:after="40"/>
+      </w:pPr>
+      <w:r>
+        <w:t>⚠️ "Touched it as a B story in April": producer's note. Not found in channel titles. Confirm what aired so the page's WHAT'S NEW is exact.</w:t>
+      </w:r>
+    </w:p>
+    <w:p>
+      <w:pPr>
+        <w:pStyle w:val="ListBullet"/>
+        <w:spacing w:after="40"/>
+      </w:pPr>
+      <w:r>
+        <w:t>⚠️ Epic Real Estate and Holy Schmidt are creator channels, not news. Upload dates (Aug 28, Aug 9) are from the producer; confirm them, and get permission to use either clip.</w:t>
+      </w:r>
+    </w:p>
+    <w:p>
+      <w:pPr>
+        <w:pStyle w:val="ListBullet"/>
+        <w:spacing w:after="40"/>
+      </w:pPr>
+      <w:r>
+        <w:t>⚠️ Harris County: Keata Wade on camera? Not confirmed. No video found. Check KPRC/KHOU/ABC13.</w:t>
       </w:r>
     </w:p>
     <w:p>
@@ -2272,7 +2357,16 @@
         <w:spacing w:after="40"/>
       </w:pPr>
       <w:r>
-        <w:t>Gold-bar courier ring: cut as a repeat. Aired 6/3 and before 7/29; see repeat_check.md.</w:t>
+        <w:t>Gold-bar courier ring: held. It aired as a beat on 6/3 (the 7/29 bible never aired); see repeat_check.md.</w:t>
+      </w:r>
+    </w:p>
+    <w:p>
+      <w:pPr>
+        <w:pStyle w:val="ListBullet"/>
+        <w:spacing w:after="40"/>
+      </w:pPr>
+      <w:r>
+        <w:t>Recovery scams ("we'll get your money back"): FTC alert Aug 3, 2026 and FBI IC3 PSA I-072026-PSA (Jul 20, 2026) loaded. No fresh US victim video found yet; the best clip is CTV W5 "The Suckers List" (522K, Nov 2024, Canadian). Parked for a future B.</w:t>
       </w:r>
     </w:p>
     <w:p>
@@ -2303,6 +2397,21 @@
           <w:sz w:val="26"/>
         </w:rPr>
         <w:t>OPEN QUESTIONS FOR THE MEETING</w:t>
+      </w:r>
+    </w:p>
+    <w:p>
+      <w:pPr>
+        <w:pStyle w:val="ListBullet"/>
+        <w:spacing w:after="40"/>
+      </w:pPr>
+      <w:r>
+        <w:rPr>
+          <w:b/>
+        </w:rPr>
+        <w:t>Story 1, shape:</w:t>
+      </w:r>
+      <w:r>
+        <w:t xml:space="preserve"> lead with the stranger forging a deed (Harris County, NJ) and turn to the insider (the caregiver)? Or open cold on the caregiver's 5.7M clip?</w:t>
       </w:r>
     </w:p>
     <w:p>

</xml_diff>

<commit_message>
W 10-07-2026 pre-bible: add B options - squatters/fake tenants, fake cops
Co-Authored-By: Claude Opus 5.5 <noreply@anthropic.com>
Claude-Session: https://claude.ai/code/session_01F5T5EfKU7bvTfCbU31zr39
</commit_message>
<xml_diff>
--- a/runs/W_10072026/10_07_Wed_Pre_Bible_Pitch.docx
+++ b/runs/W_10072026/10_07_Wed_Pre_Bible_Pitch.docx
@@ -24,7 +24,7 @@
         <w:t>Wednesday, Oct 7, 2026</w:t>
       </w:r>
       <w:r>
-        <w:t xml:space="preserve"> · A + B + two Cs · Prepared Tue, Sept 29, 2026 · Researched from national, local and official sources plus YouTube search counts (observed Sept 29). Audience 55+; no kids, Amazon, Target or Flock.</w:t>
+        <w:t xml:space="preserve"> · A + B (three options) + two Cs · Prepared Tue, Sept 29, 2026 · Researched from national, local and official sources plus YouTube search counts (observed Sept 29). Audience 55+; no kids, Amazon, Target or Flock.</w:t>
       </w:r>
     </w:p>
     <w:p>
@@ -186,7 +186,7 @@
               <w:rPr>
                 <w:sz w:val="19"/>
               </w:rPr>
-              <w:t>A forged deed, filed at the county, and your paid-off house belongs to someone else. Sometimes it's the caregiver you let in.</w:t>
+              <w:t>A forged deed filed at the county, and your paid-off house is someone else's.</w:t>
             </w:r>
           </w:p>
         </w:tc>
@@ -234,7 +234,7 @@
               <w:rPr>
                 <w:sz w:val="19"/>
               </w:rPr>
-              <w:t>HIGH — caregiver accused, not charged</w:t>
+              <w:t>HIGH — accused, not charged</w:t>
             </w:r>
           </w:p>
         </w:tc>
@@ -368,6 +368,204 @@
                 <w:b/>
                 <w:sz w:val="19"/>
               </w:rPr>
+              <w:t>STRANGERS MOVED INTO HIS HOUSE… AND HE CAN'T GET THEM OUT</w:t>
+            </w:r>
+          </w:p>
+        </w:tc>
+        <w:tc>
+          <w:tcPr>
+            <w:tcW w:type="dxa" w:w="3384"/>
+          </w:tcPr>
+          <w:p>
+            <w:pPr>
+              <w:spacing w:after="40"/>
+            </w:pPr>
+            <w:r>
+              <w:rPr>
+                <w:sz w:val="19"/>
+              </w:rPr>
+              <w:t>A stranger moves in with fake papers, and it takes years to get them out.</w:t>
+            </w:r>
+          </w:p>
+        </w:tc>
+        <w:tc>
+          <w:tcPr>
+            <w:tcW w:type="dxa" w:w="1224"/>
+          </w:tcPr>
+          <w:p>
+            <w:pPr>
+              <w:spacing w:after="40"/>
+            </w:pPr>
+            <w:r>
+              <w:rPr>
+                <w:sz w:val="19"/>
+              </w:rPr>
+              <w:t>🔥 YouTube 3.0M (Verdictly) · 1.6M (CBS Texas)</w:t>
+            </w:r>
+          </w:p>
+        </w:tc>
+        <w:tc>
+          <w:tcPr>
+            <w:tcW w:type="dxa" w:w="1656"/>
+          </w:tcPr>
+          <w:p>
+            <w:pPr>
+              <w:spacing w:after="40"/>
+            </w:pPr>
+            <w:r>
+              <w:rPr>
+                <w:sz w:val="19"/>
+              </w:rPr>
+              <w:t>Wednesday B story (option 2)</w:t>
+            </w:r>
+          </w:p>
+        </w:tc>
+        <w:tc>
+          <w:tcPr>
+            <w:tcW w:type="dxa" w:w="1224"/>
+          </w:tcPr>
+          <w:p>
+            <w:pPr>
+              <w:spacing w:after="40"/>
+            </w:pPr>
+            <w:r>
+              <w:rPr>
+                <w:sz w:val="19"/>
+              </w:rPr>
+              <w:t>HIGH — fresh laws and a suit</w:t>
+            </w:r>
+          </w:p>
+        </w:tc>
+      </w:tr>
+      <w:tr>
+        <w:tc>
+          <w:tcPr>
+            <w:tcW w:type="dxa" w:w="504"/>
+          </w:tcPr>
+          <w:p>
+            <w:pPr>
+              <w:spacing w:after="40"/>
+            </w:pPr>
+            <w:r>
+              <w:rPr>
+                <w:sz w:val="19"/>
+              </w:rPr>
+              <w:t>4</w:t>
+            </w:r>
+          </w:p>
+        </w:tc>
+        <w:tc>
+          <w:tcPr>
+            <w:tcW w:type="dxa" w:w="2088"/>
+          </w:tcPr>
+          <w:p>
+            <w:pPr>
+              <w:spacing w:after="40"/>
+            </w:pPr>
+            <w:r>
+              <w:rPr>
+                <w:b/>
+                <w:sz w:val="19"/>
+              </w:rPr>
+              <w:t>THE FLASHING LIGHTS BEHIND YOU AREN'T POLICE</w:t>
+            </w:r>
+          </w:p>
+        </w:tc>
+        <w:tc>
+          <w:tcPr>
+            <w:tcW w:type="dxa" w:w="3384"/>
+          </w:tcPr>
+          <w:p>
+            <w:pPr>
+              <w:spacing w:after="40"/>
+            </w:pPr>
+            <w:r>
+              <w:rPr>
+                <w:sz w:val="19"/>
+              </w:rPr>
+              <w:t>The "officer" pulling you over is a fake, and he may not be alone.</w:t>
+            </w:r>
+          </w:p>
+        </w:tc>
+        <w:tc>
+          <w:tcPr>
+            <w:tcW w:type="dxa" w:w="1224"/>
+          </w:tcPr>
+          <w:p>
+            <w:pPr>
+              <w:spacing w:after="40"/>
+            </w:pPr>
+            <w:r>
+              <w:rPr>
+                <w:sz w:val="19"/>
+              </w:rPr>
+              <w:t>🔥 YouTube 1.9M · 1.8M · 1.5M (bodycam channels)</w:t>
+            </w:r>
+          </w:p>
+        </w:tc>
+        <w:tc>
+          <w:tcPr>
+            <w:tcW w:type="dxa" w:w="1656"/>
+          </w:tcPr>
+          <w:p>
+            <w:pPr>
+              <w:spacing w:after="40"/>
+            </w:pPr>
+            <w:r>
+              <w:rPr>
+                <w:sz w:val="19"/>
+              </w:rPr>
+              <w:t>Wednesday B story (option 3)</w:t>
+            </w:r>
+          </w:p>
+        </w:tc>
+        <w:tc>
+          <w:tcPr>
+            <w:tcW w:type="dxa" w:w="1224"/>
+          </w:tcPr>
+          <w:p>
+            <w:pPr>
+              <w:spacing w:after="40"/>
+            </w:pPr>
+            <w:r>
+              <w:rPr>
+                <w:sz w:val="19"/>
+              </w:rPr>
+              <w:t>MEDIUM — clips unwatched</w:t>
+            </w:r>
+          </w:p>
+        </w:tc>
+      </w:tr>
+      <w:tr>
+        <w:tc>
+          <w:tcPr>
+            <w:tcW w:type="dxa" w:w="504"/>
+          </w:tcPr>
+          <w:p>
+            <w:pPr>
+              <w:spacing w:after="40"/>
+            </w:pPr>
+            <w:r>
+              <w:rPr>
+                <w:sz w:val="19"/>
+              </w:rPr>
+              <w:t>5</w:t>
+            </w:r>
+          </w:p>
+        </w:tc>
+        <w:tc>
+          <w:tcPr>
+            <w:tcW w:type="dxa" w:w="2088"/>
+          </w:tcPr>
+          <w:p>
+            <w:pPr>
+              <w:spacing w:after="40"/>
+            </w:pPr>
+            <w:r>
+              <w:rPr>
+                <w:b/>
+                <w:sz w:val="19"/>
+              </w:rPr>
               <w:t>HE CALLED FOR A GARAGE DOOR REPAIR… THE BILL WAS $12,000</w:t>
             </w:r>
           </w:p>
@@ -450,7 +648,7 @@
               <w:rPr>
                 <w:sz w:val="19"/>
               </w:rPr>
-              <w:t>4</w:t>
+              <w:t>6</w:t>
             </w:r>
           </w:p>
         </w:tc>
@@ -483,7 +681,7 @@
               <w:rPr>
                 <w:sz w:val="19"/>
               </w:rPr>
-              <w:t>A new iOS 27 setting can warn your apps you're being worked by a scammer. It ships switched off.</w:t>
+              <w:t>A new iOS 27 setting warns your apps you're being scammed. It ships off.</w:t>
             </w:r>
           </w:p>
         </w:tc>
@@ -546,7 +744,7 @@
         <w:t>SLATE FIT:</w:t>
       </w:r>
       <w:r>
-        <w:t xml:space="preserve"> Fills an A + B + two-C Wednesday. #1 carries the A: two named families, a state report and a county lawsuit from Sept 9, and the biggest fresh clips found (5.7M, 2.1M). #2 is a full B with its own victim. #3 is a light C with an 89-year-old. #4 is the do-it-now exhale: update the phone, flip one switch. #1 follows an April B on deed fraud (per producer) with new 9/9 pegs; #3 sits next to a past home-repair live.</w:t>
+        <w:t xml:space="preserve"> Fills an A + B + two-C Wednesday, with three B options (#2–#4): pick one or run two. #1 carries the A (two named families, 9/9 report and suit, 5.7M and 2.1M clips). #3 pairs with the A but overlaps it on forged deeds; #4 is the change of pace. #1 follows an April deed-fraud B (per producer).</w:t>
       </w:r>
     </w:p>
     <w:p>
@@ -1150,7 +1348,7 @@
           <w:color w:val="000000"/>
           <w:sz w:val="32"/>
         </w:rPr>
-        <w:t>3. HE CALLED FOR A GARAGE DOOR REPAIR… THE BILL WAS $12,000</w:t>
+        <w:t>3. STRANGERS MOVED INTO HIS HOUSE… AND HE CAN'T GET THEM OUT</w:t>
       </w:r>
     </w:p>
     <w:p>
@@ -1161,7 +1359,7 @@
         <w:t>Slot:</w:t>
       </w:r>
       <w:r>
-        <w:t xml:space="preserve"> Wednesday C story · </w:t>
+        <w:t xml:space="preserve"> Wednesday B story (option 2) · </w:t>
       </w:r>
       <w:r>
         <w:rPr>
@@ -1176,7 +1374,7 @@
         <w:rPr>
           <w:i/>
         </w:rPr>
-        <w:t>Overcharging, not proven fraud: get the company's side</w:t>
+        <w:t>Big demand; best clips are commentary channels</w:t>
       </w:r>
     </w:p>
     <w:p>
@@ -1187,7 +1385,38 @@
         <w:t>SLOT FIT:</w:t>
       </w:r>
       <w:r>
-        <w:t xml:space="preserve"> Wednesday C story. It fits a light slot: two named victims on camera in one 215K clip, a fresh peg (Sept 21), an 89-year-old in the demo, and a simple fix. It won't carry more than a C: one clip, one market.</w:t>
+        <w:t xml:space="preserve"> Wednesday B story. It fits: a named homeowner in a network package (1.6M), a city lawsuit (9/12), and a law taking effect Oct 1. It overlaps the A on forged deeds (Sea Cliff).</w:t>
+      </w:r>
+    </w:p>
+    <w:p>
+      <w:pPr>
+        <w:spacing w:before="80" w:after="120"/>
+        <w:ind w:left="432"/>
+      </w:pPr>
+      <w:r>
+        <w:rPr>
+          <w:i/>
+        </w:rPr>
+        <w:t xml:space="preserve">🔥 </w:t>
+      </w:r>
+      <w:r>
+        <w:rPr>
+          <w:b/>
+          <w:i/>
+        </w:rPr>
+        <w:t>VIRAL CLIP</w:t>
+      </w:r>
+      <w:r>
+        <w:rPr>
+          <w:i/>
+        </w:rPr>
+        <w:t xml:space="preserve"> — YouTube, CBS Texas, 1,638,561 views (observed 9/29), uploaded ~Sept 1 (per producer) https://www.youtube.com/watch?v=pTwLOlaBVVM · "Serial squatter sentenced to 20 years for fraud after years of victims and evictions" </w:t>
+      </w:r>
+      <w:r>
+        <w:rPr>
+          <w:i/>
+        </w:rPr>
+        <w:t>Not watched — no timecode, no outcue.</w:t>
       </w:r>
     </w:p>
     <w:p>
@@ -1211,7 +1440,7 @@
         <w:rPr>
           <w:i/>
         </w:rPr>
-        <w:t>HIS GARAGE DOOR WAS STUCK. HE FOUND AN 800 NUMBER ONLINE. WHEN THE REPAIRMAN WAS DONE… THE BILL WAS 12 THOUSAND DOLLARS. HE'S 89. SHE ANSWERED A 97-DOLLAR TUNE-UP AD. SHE PAID 4 THOUSAND. SAME COMPANY NAME ON BOTH INVOICES. THE ONE THING TO DO BEFORE ANYONE TOUCHES YOUR DOOR.</w:t>
+        <w:t>SHE RENTED YOUR HOUSE… USING HER FATHER'S NAME. SHE NEVER PAID A DIME. AND IT TOOK YEARS TO GET HER OUT. IN SAN FRANCISCO, STRANGERS FORGED THE DEED TO A 4.4 MILLION DOLLAR HOME… AND MOVED IN. STARTING THIS WEEK, ONE STATE MAKES IT A FELONY. HOW TO KEEP A STRANGER FROM MOVING INTO YOUR HOME.</w:t>
       </w:r>
     </w:p>
     <w:p>
@@ -1228,7 +1457,13 @@
     </w:p>
     <w:p>
       <w:r>
-        <w:t>ABC7 Los Angeles, Sept 21: Debbi Thompson of Woodland Hills answered a $97 garage-door tune-up text ad and paid $4,000. Paul Wexler, 89, of San Clemente called an 800 number he found online and paid $12,000, with nearly every component replaced except the door. Both invoices say "24-7 Garage Door Service." Asked about Thompson's case, the company said it was a call center. The BBB's Steve McFarland: "Once the quote is given to you, a lot of times unwritten quotes, the prices keep climbing."</w:t>
+        <w:t xml:space="preserve">Jessica Davis rented her Rowlett, Texas house through Zillow in 2023. The tenant, Heather Ruybal, used her father's name and a bad check, never paid rent, and left it filled with trash; Davis lost the home when she couldn't cover the mortgage. On Aug 31 a Dallas County judge gave Ruybal 20 years, after nearly three dozen evictions under multiple names. In San Francisco, the city attorney sued two people on Sept 12 for allegedly forging the deed to a vacant $4.4M Sea Cliff home seven times and occupying it; a judge barred any transfer. </w:t>
+      </w:r>
+      <w:r>
+        <w:rPr>
+          <w:b/>
+        </w:rPr>
+        <w:t>Oct 1, Florida's HB 1293 makes fake pay stubs, IDs or bank statements on a rental application a third-degree felony.</w:t>
       </w:r>
     </w:p>
     <w:p>
@@ -1249,6 +1484,548 @@
         <w:spacing w:after="40"/>
       </w:pPr>
       <w:r>
+        <w:rPr>
+          <w:b/>
+        </w:rPr>
+        <w:t>The fake tenant:</w:t>
+      </w:r>
+      <w:r>
+        <w:t xml:space="preserve"> stolen or borrowed identity, forged pay stubs, a first check that bounces.</w:t>
+      </w:r>
+    </w:p>
+    <w:p>
+      <w:pPr>
+        <w:pStyle w:val="ListBullet"/>
+        <w:spacing w:after="40"/>
+      </w:pPr>
+      <w:r>
+        <w:rPr>
+          <w:b/>
+        </w:rPr>
+        <w:t>Exploit the eviction clock:</w:t>
+      </w:r>
+      <w:r>
+        <w:t xml:space="preserve"> "moved into individuals' homes knowing that she wasn't going to pay… then exploit the eviction process" (Dallas County prosecutor).</w:t>
+      </w:r>
+    </w:p>
+    <w:p>
+      <w:pPr>
+        <w:pStyle w:val="ListBullet"/>
+        <w:spacing w:after="40"/>
+      </w:pPr>
+      <w:r>
+        <w:rPr>
+          <w:b/>
+        </w:rPr>
+        <w:t>The fake owner:</w:t>
+      </w:r>
+      <w:r>
+        <w:t xml:space="preserve"> a forged deed makes them "the owner," so police treat it as a civil dispute.</w:t>
+      </w:r>
+    </w:p>
+    <w:p>
+      <w:pPr>
+        <w:pStyle w:val="Heading3"/>
+      </w:pPr>
+      <w:r>
+        <w:rPr>
+          <w:color w:val="333333"/>
+          <w:sz w:val="22"/>
+        </w:rPr>
+        <w:t>FOOTAGE WE NEED</w:t>
+      </w:r>
+    </w:p>
+    <w:p>
+      <w:pPr>
+        <w:pStyle w:val="ListBullet"/>
+        <w:spacing w:after="40"/>
+      </w:pPr>
+      <w:r>
+        <w:rPr>
+          <w:b/>
+        </w:rPr>
+        <w:t>The get: CBS Texas, 1.6M</w:t>
+      </w:r>
+      <w:r>
+        <w:t xml:space="preserve"> (pTwLOlaBVVM). ABC7 SF on Sea Cliff (neighbors on camera).</w:t>
+      </w:r>
+    </w:p>
+    <w:p>
+      <w:pPr>
+        <w:pStyle w:val="ListBullet"/>
+        <w:spacing w:after="40"/>
+      </w:pPr>
+      <w:r>
+        <w:t>A&amp;E "Squatters" clips (up to 882K) for b-roll. Verdictly 3.0M and Baxter 2.3M prove demand but aren't usable footage.</w:t>
+      </w:r>
+    </w:p>
+    <w:p>
+      <w:pPr>
+        <w:pStyle w:val="Heading3"/>
+      </w:pPr>
+      <w:r>
+        <w:rPr>
+          <w:color w:val="333333"/>
+          <w:sz w:val="22"/>
+        </w:rPr>
+        <w:t>THE PAYOFF</w:t>
+      </w:r>
+    </w:p>
+    <w:p>
+      <w:pPr>
+        <w:pStyle w:val="ListBullet"/>
+        <w:spacing w:after="40"/>
+      </w:pPr>
+      <w:r>
+        <w:t>Renting out a home: verify ID in person, call the employer, and confirm pay stubs with the bank, not the applicant.</w:t>
+      </w:r>
+    </w:p>
+    <w:p>
+      <w:pPr>
+        <w:pStyle w:val="ListBullet"/>
+        <w:spacing w:after="40"/>
+      </w:pPr>
+      <w:r>
+        <w:t>Never hand over keys on a first check. Wait for it to clear.</w:t>
+      </w:r>
+    </w:p>
+    <w:p>
+      <w:pPr>
+        <w:pStyle w:val="ListBullet"/>
+        <w:spacing w:after="40"/>
+      </w:pPr>
+      <w:r>
+        <w:t xml:space="preserve">Vacant or inherited home? Get the county deed alert and have it checked weekly. Florida, from Oct 1: fake rental papers are a felony. </w:t>
+      </w:r>
+      <w:r>
+        <w:rPr>
+          <w:i/>
+        </w:rPr>
+        <w:t>(verify)</w:t>
+      </w:r>
+    </w:p>
+    <w:p>
+      <w:r>
+        <w:br w:type="page"/>
+      </w:r>
+    </w:p>
+    <w:p>
+      <w:pPr>
+        <w:pStyle w:val="Heading1"/>
+      </w:pPr>
+      <w:r>
+        <w:rPr>
+          <w:color w:val="000000"/>
+          <w:sz w:val="32"/>
+        </w:rPr>
+        <w:t>4. THE FLASHING LIGHTS BEHIND YOU AREN'T POLICE</w:t>
+      </w:r>
+    </w:p>
+    <w:p>
+      <w:r>
+        <w:rPr>
+          <w:b/>
+        </w:rPr>
+        <w:t>Slot:</w:t>
+      </w:r>
+      <w:r>
+        <w:t xml:space="preserve"> Wednesday B story (option 3) · </w:t>
+      </w:r>
+      <w:r>
+        <w:rPr>
+          <w:b/>
+        </w:rPr>
+        <w:t>Confidence: MEDIUM</w:t>
+      </w:r>
+      <w:r>
+        <w:t xml:space="preserve"> · </w:t>
+      </w:r>
+      <w:r>
+        <w:rPr>
+          <w:i/>
+        </w:rPr>
+        <w:t>Huge clips, medium 55+ fit, footage unwatched</w:t>
+      </w:r>
+    </w:p>
+    <w:p>
+      <w:r>
+        <w:rPr>
+          <w:b/>
+        </w:rPr>
+        <w:t>SLOT FIT:</w:t>
+      </w:r>
+      <w:r>
+        <w:t xml:space="preserve"> Wednesday B story. It fits a lighter B: a fresh arrest on camera-ready turf (Phoenix, 9/17), a second case (Fayetteville, 9/27), and four bodycam uploads at 580K–1.9M. It's not a scam story; it's personal safety. The producer's read on 55+ fit is medium.</w:t>
+      </w:r>
+    </w:p>
+    <w:p>
+      <w:pPr>
+        <w:spacing w:before="80" w:after="120"/>
+        <w:ind w:left="432"/>
+      </w:pPr>
+      <w:r>
+        <w:rPr>
+          <w:i/>
+        </w:rPr>
+        <w:t xml:space="preserve">🔥 </w:t>
+      </w:r>
+      <w:r>
+        <w:rPr>
+          <w:b/>
+          <w:i/>
+        </w:rPr>
+        <w:t>VIRAL CLIP</w:t>
+      </w:r>
+      <w:r>
+        <w:rPr>
+          <w:i/>
+        </w:rPr>
+        <w:t xml:space="preserve"> — YouTube, Sergeant Curtis, "Police Impersonator vs Funniest Cop Of All Time," 1,940,891 views (observed 9/29), uploaded Aug 15 (per producer) https://www.youtube.com/watch?v=UqPk-E7EWmc </w:t>
+      </w:r>
+      <w:r>
+        <w:rPr>
+          <w:i/>
+        </w:rPr>
+        <w:t>Not watched — no timecode, no outcue; not confirmed it shows an impersonator.</w:t>
+      </w:r>
+    </w:p>
+    <w:p>
+      <w:pPr>
+        <w:pStyle w:val="Heading3"/>
+      </w:pPr>
+      <w:r>
+        <w:rPr>
+          <w:color w:val="333333"/>
+          <w:sz w:val="22"/>
+        </w:rPr>
+        <w:t>WORKING TEASE</w:t>
+      </w:r>
+    </w:p>
+    <w:p>
+      <w:pPr>
+        <w:spacing w:before="80" w:after="120"/>
+        <w:ind w:left="432"/>
+      </w:pPr>
+      <w:r>
+        <w:rPr>
+          <w:i/>
+        </w:rPr>
+        <w:t>RED AND BLUE LIGHTS IN YOUR MIRROR. YOU PULL OVER. EVERYBODY DOES. BUT THE MAN WALKING UP TO YOUR WINDOW ISN'T A COP. THIS MONTH IN PHOENIX, POLICE SAY A FAKE OFFICER PULLED A CAR OVER ON THE FREEWAY… AND MAY HAVE DONE IT BEFORE. WHAT TO DO THE SECOND THOSE LIGHTS COME ON… THAT REAL POLICE SAY IS OK.</w:t>
+      </w:r>
+    </w:p>
+    <w:p>
+      <w:pPr>
+        <w:pStyle w:val="Heading3"/>
+      </w:pPr>
+      <w:r>
+        <w:rPr>
+          <w:color w:val="333333"/>
+          <w:sz w:val="22"/>
+        </w:rPr>
+        <w:t>THE HOOK</w:t>
+      </w:r>
+    </w:p>
+    <w:p>
+      <w:r>
+        <w:t>On Sept 17, Arizona DPS arrested a man it says pulled over a Tesla on I-17 in north Phoenix. He was driving a Chevy pickup with red and blue lights on the dash, and he had no police authority. DPS fears he "may have stopped other motorists" and asked other drivers to call. Azfamily and Yahoo name him as Scott Carl Millage, 60, of Cave Creek, charged with impersonating a peace officer, unlawful imprisonment and kidnapping. In Fayetteville, NC, police say Jayden Boone, 27, knocked on a door in police gear stolen from an officer's home, went in and robbed the residents (arrested ~Sept 27).</w:t>
+      </w:r>
+    </w:p>
+    <w:p>
+      <w:pPr>
+        <w:pStyle w:val="Heading3"/>
+      </w:pPr>
+      <w:r>
+        <w:rPr>
+          <w:color w:val="333333"/>
+          <w:sz w:val="22"/>
+        </w:rPr>
+        <w:t>HOW IT WORKS</w:t>
+      </w:r>
+    </w:p>
+    <w:p>
+      <w:pPr>
+        <w:pStyle w:val="ListBullet"/>
+        <w:spacing w:after="40"/>
+      </w:pPr>
+      <w:r>
+        <w:rPr>
+          <w:b/>
+        </w:rPr>
+        <w:t>Dash lights are cheap</w:t>
+      </w:r>
+      <w:r>
+        <w:t xml:space="preserve"> and sold online. An unmarked pickup looks "undercover."</w:t>
+      </w:r>
+    </w:p>
+    <w:p>
+      <w:pPr>
+        <w:pStyle w:val="ListBullet"/>
+        <w:spacing w:after="40"/>
+      </w:pPr>
+      <w:r>
+        <w:rPr>
+          <w:b/>
+        </w:rPr>
+        <w:t>Pulling over is reflex</w:t>
+      </w:r>
+      <w:r>
+        <w:t>, and the fake counts on it.</w:t>
+      </w:r>
+    </w:p>
+    <w:p>
+      <w:pPr>
+        <w:pStyle w:val="ListBullet"/>
+        <w:spacing w:after="40"/>
+      </w:pPr>
+      <w:r>
+        <w:t xml:space="preserve">At the door, </w:t>
+      </w:r>
+      <w:r>
+        <w:rPr>
+          <w:b/>
+        </w:rPr>
+        <w:t>stolen or bought gear</w:t>
+      </w:r>
+      <w:r>
+        <w:t xml:space="preserve"> does the same job.</w:t>
+      </w:r>
+    </w:p>
+    <w:p>
+      <w:pPr>
+        <w:pStyle w:val="Heading3"/>
+      </w:pPr>
+      <w:r>
+        <w:rPr>
+          <w:color w:val="333333"/>
+          <w:sz w:val="22"/>
+        </w:rPr>
+        <w:t>FOOTAGE WE NEED</w:t>
+      </w:r>
+    </w:p>
+    <w:p>
+      <w:pPr>
+        <w:pStyle w:val="ListBullet"/>
+        <w:spacing w:after="40"/>
+      </w:pPr>
+      <w:r>
+        <w:rPr>
+          <w:b/>
+        </w:rPr>
+        <w:t>The get: Phoenix local news</w:t>
+      </w:r>
+      <w:r>
+        <w:t xml:space="preserve"> (FOX 10, azfamily) on the I-17 arrest.</w:t>
+      </w:r>
+    </w:p>
+    <w:p>
+      <w:pPr>
+        <w:pStyle w:val="ListBullet"/>
+        <w:spacing w:after="40"/>
+      </w:pPr>
+      <w:r>
+        <w:t xml:space="preserve">Bodycam channels: Sergeant Curtis 1.9M, FirstResponderFiles 1.8M, Sergeant Steve 1.5M, Raw Authority 581K. Aggregators, so rights are unclear, and </w:t>
+      </w:r>
+      <w:r>
+        <w:rPr>
+          <w:b/>
+        </w:rPr>
+        <w:t>each must be screened</w:t>
+      </w:r>
+      <w:r>
+        <w:t xml:space="preserve"> to confirm it shows an impersonator. Raw Authority's title is a fake FBI "certificate scam," which may not be a traffic stop.</w:t>
+      </w:r>
+    </w:p>
+    <w:p>
+      <w:pPr>
+        <w:pStyle w:val="ListBullet"/>
+        <w:spacing w:after="40"/>
+      </w:pPr>
+      <w:r>
+        <w:t>Jeff demo: what a real unmarked car and credentials look like.</w:t>
+      </w:r>
+    </w:p>
+    <w:p>
+      <w:pPr>
+        <w:pStyle w:val="Heading3"/>
+      </w:pPr>
+      <w:r>
+        <w:rPr>
+          <w:color w:val="333333"/>
+          <w:sz w:val="22"/>
+        </w:rPr>
+        <w:t>THE PAYOFF</w:t>
+      </w:r>
+    </w:p>
+    <w:p>
+      <w:pPr>
+        <w:pStyle w:val="ListBullet"/>
+        <w:spacing w:after="40"/>
+      </w:pPr>
+      <w:r>
+        <w:t xml:space="preserve">Not sure? </w:t>
+      </w:r>
+      <w:r>
+        <w:rPr>
+          <w:b/>
+        </w:rPr>
+        <w:t>Turn on your hazards, slow down and drive to a well-lit, busy place:</w:t>
+      </w:r>
+      <w:r>
+        <w:t xml:space="preserve"> gas station, fire or police station. </w:t>
+      </w:r>
+      <w:r>
+        <w:rPr>
+          <w:i/>
+        </w:rPr>
+        <w:t>(AZ DPS)</w:t>
+      </w:r>
+    </w:p>
+    <w:p>
+      <w:pPr>
+        <w:pStyle w:val="ListBullet"/>
+        <w:spacing w:after="40"/>
+      </w:pPr>
+      <w:r>
+        <w:rPr>
+          <w:b/>
+        </w:rPr>
+        <w:t>Call 911</w:t>
+      </w:r>
+      <w:r>
+        <w:t xml:space="preserve"> and ask the dispatcher to confirm the stop is real.</w:t>
+      </w:r>
+    </w:p>
+    <w:p>
+      <w:pPr>
+        <w:pStyle w:val="ListBullet"/>
+        <w:spacing w:after="40"/>
+      </w:pPr>
+      <w:r>
+        <w:t>Keep doors locked. Crack the window only after you see a marked car, uniform and badge.</w:t>
+      </w:r>
+    </w:p>
+    <w:p>
+      <w:pPr>
+        <w:pStyle w:val="ListBullet"/>
+        <w:spacing w:after="40"/>
+      </w:pPr>
+      <w:r>
+        <w:t>Stopped by one? Arizona: 1-877-4AZ-TIPS. Elsewhere: 911.</w:t>
+      </w:r>
+    </w:p>
+    <w:p>
+      <w:r>
+        <w:br w:type="page"/>
+      </w:r>
+    </w:p>
+    <w:p>
+      <w:pPr>
+        <w:pStyle w:val="Heading1"/>
+      </w:pPr>
+      <w:r>
+        <w:rPr>
+          <w:color w:val="000000"/>
+          <w:sz w:val="32"/>
+        </w:rPr>
+        <w:t>5. HE CALLED FOR A GARAGE DOOR REPAIR… THE BILL WAS $12,000</w:t>
+      </w:r>
+    </w:p>
+    <w:p>
+      <w:r>
+        <w:rPr>
+          <w:b/>
+        </w:rPr>
+        <w:t>Slot:</w:t>
+      </w:r>
+      <w:r>
+        <w:t xml:space="preserve"> Wednesday C story · </w:t>
+      </w:r>
+      <w:r>
+        <w:rPr>
+          <w:b/>
+        </w:rPr>
+        <w:t>Confidence: HIGH</w:t>
+      </w:r>
+      <w:r>
+        <w:t xml:space="preserve"> · </w:t>
+      </w:r>
+      <w:r>
+        <w:rPr>
+          <w:i/>
+        </w:rPr>
+        <w:t>Overcharging, not proven fraud: get the company's side</w:t>
+      </w:r>
+    </w:p>
+    <w:p>
+      <w:r>
+        <w:rPr>
+          <w:b/>
+        </w:rPr>
+        <w:t>SLOT FIT:</w:t>
+      </w:r>
+      <w:r>
+        <w:t xml:space="preserve"> Wednesday C story. It fits a light slot: two named victims on camera in one 215K clip, a fresh peg (Sept 21), an 89-year-old in the demo, and a simple fix. It won't carry more than a C: one clip, one market.</w:t>
+      </w:r>
+    </w:p>
+    <w:p>
+      <w:pPr>
+        <w:pStyle w:val="Heading3"/>
+      </w:pPr>
+      <w:r>
+        <w:rPr>
+          <w:color w:val="333333"/>
+          <w:sz w:val="22"/>
+        </w:rPr>
+        <w:t>WORKING TEASE</w:t>
+      </w:r>
+    </w:p>
+    <w:p>
+      <w:pPr>
+        <w:spacing w:before="80" w:after="120"/>
+        <w:ind w:left="432"/>
+      </w:pPr>
+      <w:r>
+        <w:rPr>
+          <w:i/>
+        </w:rPr>
+        <w:t>HIS GARAGE DOOR WAS STUCK. HE FOUND AN 800 NUMBER ONLINE. WHEN THE REPAIRMAN WAS DONE… THE BILL WAS 12 THOUSAND DOLLARS. HE'S 89. SHE ANSWERED A 97-DOLLAR TUNE-UP AD. SHE PAID 4 THOUSAND. SAME COMPANY NAME ON BOTH INVOICES. THE ONE THING TO DO BEFORE ANYONE TOUCHES YOUR DOOR.</w:t>
+      </w:r>
+    </w:p>
+    <w:p>
+      <w:pPr>
+        <w:pStyle w:val="Heading3"/>
+      </w:pPr>
+      <w:r>
+        <w:rPr>
+          <w:color w:val="333333"/>
+          <w:sz w:val="22"/>
+        </w:rPr>
+        <w:t>THE HOOK</w:t>
+      </w:r>
+    </w:p>
+    <w:p>
+      <w:r>
+        <w:t>ABC7 Los Angeles, Sept 21: Debbi Thompson of Woodland Hills answered a $97 garage-door tune-up text ad and paid $4,000. Paul Wexler, 89, of San Clemente called an 800 number he found online and paid $12,000, with nearly every component replaced except the door. Both invoices say "24-7 Garage Door Service." Asked about Thompson's case, the company said it was a call center. The BBB's Steve McFarland: "Once the quote is given to you, a lot of times unwritten quotes, the prices keep climbing."</w:t>
+      </w:r>
+    </w:p>
+    <w:p>
+      <w:pPr>
+        <w:pStyle w:val="Heading3"/>
+      </w:pPr>
+      <w:r>
+        <w:rPr>
+          <w:color w:val="333333"/>
+          <w:sz w:val="22"/>
+        </w:rPr>
+        <w:t>HOW IT WORKS</w:t>
+      </w:r>
+    </w:p>
+    <w:p>
+      <w:pPr>
+        <w:pStyle w:val="ListBullet"/>
+        <w:spacing w:after="40"/>
+      </w:pPr>
+      <w:r>
         <w:t>A low price gets the tech in the garage: a $97 ad, or a generic "24-7" listing.</w:t>
       </w:r>
     </w:p>
@@ -1403,7 +2180,7 @@
           <w:color w:val="000000"/>
           <w:sz w:val="32"/>
         </w:rPr>
-        <w:t>4. YOUR IPHONE CAN NOW SPOT A SCAM IN PROGRESS… BUT IT'S TURNED OFF</w:t>
+        <w:t>6. YOUR IPHONE CAN NOW SPOT A SCAM IN PROGRESS… BUT IT'S TURNED OFF</w:t>
       </w:r>
     </w:p>
     <w:p>
@@ -2094,7 +2871,7 @@
           <w:color w:val="333333"/>
           <w:sz w:val="22"/>
         </w:rPr>
-        <w:t>STORY 3 — GARAGE DOOR</w:t>
+        <w:t>STORY 3 — SQUATTERS AND FAKE TENANTS</w:t>
       </w:r>
     </w:p>
     <w:p>
@@ -2111,7 +2888,7 @@
         <w:spacing w:after="40"/>
       </w:pPr>
       <w:r>
-        <w:t>ABC7 LA, Sept 21, 2026 (Leanne Suter): Thompson, Woodland Hills, $97 text ad, paid $4,000. Wexler, 89, San Clemente, 800 number found online, paid $12,000. "24-7 Garage Door Service" on both invoices. Company said it was a call center. BBB's Steve McFarland quote. abc7.com/post/socal-homeowners-seeking-garage-door-repairs-fall-victim-overcharging-scam/19855228/</w:t>
+        <w:t>Yahoo/Moneywise: Heather Ruybal (aliases "Jenkins," "Rayes") rented homeowner Jessica Davis's Rowlett, TX house via Zillow in 2023 using her father's name and a bad check. 20-year sentence Aug 31, 2026, under Texas Penal Code 30.05. $40,000 restitution. "Nearly three dozen evictions." ADA Amber Moore quote. Davis lost the home over the mortgage. finance.yahoo.com/real-estate/articles/serial-squatter-gets-20-years-133000916.html</w:t>
       </w:r>
     </w:p>
     <w:p>
@@ -2120,7 +2897,43 @@
         <w:spacing w:after="40"/>
       </w:pPr>
       <w:r>
-        <w:t>Clip: ABC7 215,082 views (Sept 29).</w:t>
+        <w:t>ABC7 SF, Sept 12, 2026: SF City Attorney's suit over 250 32nd Ave (Sea Cliff), $4.4M, abandoned since 2020, owner abroad and unreachable, deed changed hands at least seven times in a year, notaries say their signatures were forged. Neighbor: "It's scary -- I go to bed nervous." abc7news.com/post/alleged-squatters-take-44-million-san-francisco-sea-cliff-property-year-city-attorney-files-lawsuit/19807938/</w:t>
+      </w:r>
+    </w:p>
+    <w:p>
+      <w:pPr>
+        <w:pStyle w:val="ListBullet"/>
+        <w:spacing w:after="40"/>
+      </w:pPr>
+      <w:r>
+        <w:t>SF Standard, Sept 17: defendants skipped court; judge issued a TRO barring transfer (search result). SF Chronicle: City Attorney David Chiu sued Brandon Aadee and Diana Peng (search result).</w:t>
+      </w:r>
+    </w:p>
+    <w:p>
+      <w:pPr>
+        <w:pStyle w:val="ListBullet"/>
+        <w:spacing w:after="40"/>
+      </w:pPr>
+      <w:r>
+        <w:t>Florida HB 1293, "Fraudulent Entry of Residential Dwellings," effective Oct 1, 2026: third-degree felony; landlord may terminate with 7-day notice; passed 110–0 and 34–0 (search results: CBS12, FOX 35, property-management blogs).</w:t>
+      </w:r>
+    </w:p>
+    <w:p>
+      <w:pPr>
+        <w:pStyle w:val="ListBullet"/>
+        <w:spacing w:after="40"/>
+      </w:pPr>
+      <w:r>
+        <w:t>Clips (9/29): Verdictly 3,030,453 · Detective Andrew Baxter 2,265,114 · CBS Texas 1,638,561 · A&amp;E "Squatters" clips 882K / 820K / 231K.</w:t>
+      </w:r>
+    </w:p>
+    <w:p>
+      <w:pPr>
+        <w:pStyle w:val="ListBullet"/>
+        <w:spacing w:after="40"/>
+      </w:pPr>
+      <w:r>
+        <w:t>Repeat check: no squatter or tenant title on the Rossen channel.</w:t>
       </w:r>
     </w:p>
     <w:p>
@@ -2131,7 +2944,7 @@
         <w:t>Sources:</w:t>
       </w:r>
       <w:r>
-        <w:t xml:space="preserve"> URL at the end of each Confirmed line above; full lane notes in runs/W_10072026/research/.</w:t>
+        <w:t xml:space="preserve"> URL at the end of each Confirmed line above.</w:t>
       </w:r>
     </w:p>
     <w:p>
@@ -2148,7 +2961,7 @@
         <w:spacing w:after="40"/>
       </w:pPr>
       <w:r>
-        <w:t>🚨 Naming "24-7 Garage Door Service" on air: get its response or attribute strictly to ABC7's reporting. It's overcharging, not a fraud finding.</w:t>
+        <w:t>⚠️ Name: CBS/Yahoo headlines use "Heather Schwab" in one summary and "Ruybal" elsewhere. Confirm the legal name before air.</w:t>
       </w:r>
     </w:p>
     <w:p>
@@ -2157,7 +2970,43 @@
         <w:spacing w:after="40"/>
       </w:pPr>
       <w:r>
-        <w:t>⚠️ The pass-1 note said Wexler answered a "$97 text ad." The article says Thompson did; Wexler used an 800 number. The tease keeps them apart.</w:t>
+        <w:t>⚠️ Sea Cliff: one outlet says the deed was forged "eight times," ABC7 says "at least seven." Use "again and again." Defendants are accused; no criminal charges found.</w:t>
+      </w:r>
+    </w:p>
+    <w:p>
+      <w:pPr>
+        <w:pStyle w:val="ListBullet"/>
+        <w:spacing w:after="40"/>
+      </w:pPr>
+      <w:r>
+        <w:t>⚠️ HB 1293 details come from search summaries. Pull the enrolled bill text.</w:t>
+      </w:r>
+    </w:p>
+    <w:p>
+      <w:pPr>
+        <w:pStyle w:val="ListBullet"/>
+        <w:spacing w:after="40"/>
+      </w:pPr>
+      <w:r>
+        <w:t>⚠️ The producer's A&amp;E link (nLO_bXueLi0) did not resolve in search. Confirm it, or use the alternates.</w:t>
+      </w:r>
+    </w:p>
+    <w:p>
+      <w:pPr>
+        <w:pStyle w:val="ListBullet"/>
+        <w:spacing w:after="40"/>
+      </w:pPr>
+      <w:r>
+        <w:t>⚠️ The producer's headline says "HIS house"; the named homeowner (Jessica Davis) is a woman. Consider "HER HOUSE" or "YOUR HOUSE."</w:t>
+      </w:r>
+    </w:p>
+    <w:p>
+      <w:pPr>
+        <w:pStyle w:val="ListBullet"/>
+        <w:spacing w:after="40"/>
+      </w:pPr>
+      <w:r>
+        <w:t>⚠️ The Sea Cliff case is also deed fraud. Keep the A and this B from telling the same story twice.</w:t>
       </w:r>
     </w:p>
     <w:p>
@@ -2169,7 +3018,211 @@
           <w:color w:val="333333"/>
           <w:sz w:val="22"/>
         </w:rPr>
-        <w:t>STORY 4 — iOS 27 IMPERSONATION RISK DETECTION</w:t>
+        <w:t>STORY 4 — FAKE COPS</w:t>
+      </w:r>
+    </w:p>
+    <w:p>
+      <w:r>
+        <w:rPr>
+          <w:b/>
+        </w:rPr>
+        <w:t>Confirmed:</w:t>
+      </w:r>
+    </w:p>
+    <w:p>
+      <w:pPr>
+        <w:pStyle w:val="ListBullet"/>
+        <w:spacing w:after="40"/>
+      </w:pPr>
+      <w:r>
+        <w:t>AZ DPS release #1138, Sept 17, 2026: I-17 southbound near Dove Valley Rd; a silver Tesla pulled over by a gray/silver Chevrolet 2500 pickup with red and blue dash lights; "no law enforcement authority"; DPS fears he "may have stopped other motorists"; tips line 1-877-4AZ-TIPS; safety advice (hazards, lit populated area, call 911, doors locked). azdps.gov/news/releases/1138</w:t>
+      </w:r>
+    </w:p>
+    <w:p>
+      <w:pPr>
+        <w:pStyle w:val="ListBullet"/>
+        <w:spacing w:after="40"/>
+      </w:pPr>
+      <w:r>
+        <w:t>Search results (azfamily 9/18, FOX 10, Yahoo): Scott Carl Millage, 60, of Cave Creek; charged with impersonating a peace officer, unlawful imprisonment and kidnapping.</w:t>
+      </w:r>
+    </w:p>
+    <w:p>
+      <w:pPr>
+        <w:pStyle w:val="ListBullet"/>
+        <w:spacing w:after="40"/>
+      </w:pPr>
+      <w:r>
+        <w:t>ABC11 / WRAL (search results): Jayden Boone, 27, charged with robbery with a dangerous weapon and impersonating an officer; wore Fayetteville PD gear stolen from an officer's home; warrant says $7 taken. abc11.com/post/fayetteville-man-arrested-home-robbery-impersonating-police/19881192/</w:t>
+      </w:r>
+    </w:p>
+    <w:p>
+      <w:pPr>
+        <w:pStyle w:val="ListBullet"/>
+        <w:spacing w:after="40"/>
+      </w:pPr>
+      <w:r>
+        <w:t>Clips (9/29): Sergeant Curtis 1,940,891 (UqPk-E7EWmc) · FirstResponderFiles "Fake Cops Pull Over Drivers, Then Real Police Show Up" 1,831,579 (nn8kp048BgU) · Sergeant Steve "This Fake Cop Made The Wrong Traffic Stop" 1,522,561 (lErYMZLqKu8) · Raw Authority "Fake FBI Special Agent's Year-Long Certificate Scam Ends in Handcuffs" 581,322 (1r4FXHEVWHw).</w:t>
+      </w:r>
+    </w:p>
+    <w:p>
+      <w:pPr>
+        <w:pStyle w:val="ListBullet"/>
+        <w:spacing w:after="40"/>
+      </w:pPr>
+      <w:r>
+        <w:t>Repeat check: no fake-cop or impersonator title on the Rossen channel.</w:t>
+      </w:r>
+    </w:p>
+    <w:p>
+      <w:r>
+        <w:rPr>
+          <w:b/>
+        </w:rPr>
+        <w:t>Sources:</w:t>
+      </w:r>
+      <w:r>
+        <w:t xml:space="preserve"> URL at the end of each Confirmed line above.</w:t>
+      </w:r>
+    </w:p>
+    <w:p>
+      <w:r>
+        <w:rPr>
+          <w:b/>
+        </w:rPr>
+        <w:t>NEEDS VERIFICATION:</w:t>
+      </w:r>
+    </w:p>
+    <w:p>
+      <w:pPr>
+        <w:pStyle w:val="ListBullet"/>
+        <w:spacing w:after="40"/>
+      </w:pPr>
+      <w:r>
+        <w:t xml:space="preserve">🚨 </w:t>
+      </w:r>
+      <w:r>
+        <w:rPr>
+          <w:b/>
+        </w:rPr>
+        <w:t>Nobody has watched the bodycam videos.</w:t>
+      </w:r>
+      <w:r>
+        <w:t xml:space="preserve"> Titles like "Funniest Cop Of All Time" may be comedy edits of an unrelated stop. Screen all four, find each original agency, and clear rights.</w:t>
+      </w:r>
+    </w:p>
+    <w:p>
+      <w:pPr>
+        <w:pStyle w:val="ListBullet"/>
+        <w:spacing w:after="40"/>
+      </w:pPr>
+      <w:r>
+        <w:t>⚠️ Millage's name and charges come from search results, not the DPS release (which doesn't name him). Load azfamily or FOX 10 before naming him.</w:t>
+      </w:r>
+    </w:p>
+    <w:p>
+      <w:pPr>
+        <w:pStyle w:val="ListBullet"/>
+        <w:spacing w:after="40"/>
+      </w:pPr>
+      <w:r>
+        <w:t>⚠️ Fayetteville: "$7 taken" and the arrest date come from search results; the producer's note says ABC11 Sept 27. Confirm.</w:t>
+      </w:r>
+    </w:p>
+    <w:p>
+      <w:pPr>
+        <w:pStyle w:val="ListBullet"/>
+        <w:spacing w:after="40"/>
+      </w:pPr>
+      <w:r>
+        <w:t>⚠️ 55+ fit is medium (the producer's 0.50). No 55+ victim named.</w:t>
+      </w:r>
+    </w:p>
+    <w:p>
+      <w:pPr>
+        <w:pStyle w:val="Heading3"/>
+      </w:pPr>
+      <w:r>
+        <w:rPr>
+          <w:color w:val="333333"/>
+          <w:sz w:val="22"/>
+        </w:rPr>
+        <w:t>STORY 5 — GARAGE DOOR</w:t>
+      </w:r>
+    </w:p>
+    <w:p>
+      <w:r>
+        <w:rPr>
+          <w:b/>
+        </w:rPr>
+        <w:t>Confirmed:</w:t>
+      </w:r>
+    </w:p>
+    <w:p>
+      <w:pPr>
+        <w:pStyle w:val="ListBullet"/>
+        <w:spacing w:after="40"/>
+      </w:pPr>
+      <w:r>
+        <w:t>ABC7 LA, Sept 21, 2026 (Leanne Suter): Thompson, Woodland Hills, $97 text ad, paid $4,000. Wexler, 89, San Clemente, 800 number found online, paid $12,000. "24-7 Garage Door Service" on both invoices. Company said it was a call center. BBB's Steve McFarland quote. abc7.com/post/socal-homeowners-seeking-garage-door-repairs-fall-victim-overcharging-scam/19855228/</w:t>
+      </w:r>
+    </w:p>
+    <w:p>
+      <w:pPr>
+        <w:pStyle w:val="ListBullet"/>
+        <w:spacing w:after="40"/>
+      </w:pPr>
+      <w:r>
+        <w:t>Clip: ABC7 215,082 views (Sept 29).</w:t>
+      </w:r>
+    </w:p>
+    <w:p>
+      <w:r>
+        <w:rPr>
+          <w:b/>
+        </w:rPr>
+        <w:t>Sources:</w:t>
+      </w:r>
+      <w:r>
+        <w:t xml:space="preserve"> URL at the end of each Confirmed line above; full lane notes in runs/W_10072026/research/.</w:t>
+      </w:r>
+    </w:p>
+    <w:p>
+      <w:r>
+        <w:rPr>
+          <w:b/>
+        </w:rPr>
+        <w:t>NEEDS VERIFICATION:</w:t>
+      </w:r>
+    </w:p>
+    <w:p>
+      <w:pPr>
+        <w:pStyle w:val="ListBullet"/>
+        <w:spacing w:after="40"/>
+      </w:pPr>
+      <w:r>
+        <w:t>🚨 Naming "24-7 Garage Door Service" on air: get its response or attribute strictly to ABC7's reporting. It's overcharging, not a fraud finding.</w:t>
+      </w:r>
+    </w:p>
+    <w:p>
+      <w:pPr>
+        <w:pStyle w:val="ListBullet"/>
+        <w:spacing w:after="40"/>
+      </w:pPr>
+      <w:r>
+        <w:t>⚠️ The pass-1 note said Wexler answered a "$97 text ad." The article says Thompson did; Wexler used an 800 number. The tease keeps them apart.</w:t>
+      </w:r>
+    </w:p>
+    <w:p>
+      <w:pPr>
+        <w:pStyle w:val="Heading3"/>
+      </w:pPr>
+      <w:r>
+        <w:rPr>
+          <w:color w:val="333333"/>
+          <w:sz w:val="22"/>
+        </w:rPr>
+        <w:t>STORY 6 — iOS 27 IMPERSONATION RISK DETECTION</w:t>
       </w:r>
     </w:p>
     <w:p>
@@ -2498,10 +3551,10 @@
         <w:rPr>
           <w:b/>
         </w:rPr>
-        <w:t>Story 3:</w:t>
-      </w:r>
-      <w:r>
-        <w:t xml:space="preserve"> do we name the company without its response?</w:t>
+        <w:t>B slot:</w:t>
+      </w:r>
+      <w:r>
+        <w:t xml:space="preserve"> which B runs: #2 face match, #3 squatters or #4 fake cops? Or run two? #3 overlaps the A (both forged deeds).</w:t>
       </w:r>
     </w:p>
     <w:p>
@@ -2513,7 +3566,22 @@
         <w:rPr>
           <w:b/>
         </w:rPr>
-        <w:t>Story 4:</w:t>
+        <w:t>Story 5:</w:t>
+      </w:r>
+      <w:r>
+        <w:t xml:space="preserve"> do we name the company without its response?</w:t>
+      </w:r>
+    </w:p>
+    <w:p>
+      <w:pPr>
+        <w:pStyle w:val="ListBullet"/>
+        <w:spacing w:after="40"/>
+      </w:pPr>
+      <w:r>
+        <w:rPr>
+          <w:b/>
+        </w:rPr>
+        <w:t>Story 6:</w:t>
       </w:r>
       <w:r>
         <w:t xml:space="preserve"> if no bank supports it by air, do we still run it as "turn it on now"? And do we fold in iOS 26 Call Screening for the 'detect scam calls' angle?</w:t>

</xml_diff>